<commit_message>
AM (bce-01, sqd-01 수정), RTM (설계 bce 식별자 추가), Uml (설계 BCE/C;ass diagram 작성
</commit_message>
<xml_diff>
--- a/Document/PLC/요구사항정의서(SRD).docx
+++ b/Document/PLC/요구사항정의서(SRD).docx
@@ -171,7 +171,6 @@
           <w:szCs w:val="26"/>
         </w:rPr>
       </w:pPr>
-      <w:proofErr w:type="gramStart"/>
       <w:r>
         <w:rPr>
           <w:rFonts w:ascii="맑은 고딕" w:eastAsia="맑은 고딕" w:hAnsi="맑은 고딕" w:cs="맑은 고딕"/>
@@ -181,9 +180,19 @@
           <w:sz w:val="26"/>
           <w:szCs w:val="26"/>
         </w:rPr>
-        <w:t>[ 시스템명</w:t>
+        <w:t xml:space="preserve">[ 시스템명: </w:t>
       </w:r>
-      <w:proofErr w:type="gramEnd"/>
+      <w:r>
+        <w:rPr>
+          <w:rFonts w:ascii="맑은 고딕" w:eastAsia="맑은 고딕" w:hAnsi="맑은 고딕" w:cs="맑은 고딕"/>
+          <w:b/>
+          <w:bCs/>
+          <w:color w:val="0000FF"/>
+          <w:sz w:val="26"/>
+          <w:szCs w:val="26"/>
+        </w:rPr>
+        <w:t xml:space="preserve">엘리베이터형 자판기 시스템 </w:t>
+      </w:r>
       <w:r>
         <w:rPr>
           <w:rFonts w:ascii="맑은 고딕" w:eastAsia="맑은 고딕" w:hAnsi="맑은 고딕" w:cs="맑은 고딕"/>
@@ -193,43 +202,8 @@
           <w:sz w:val="26"/>
           <w:szCs w:val="26"/>
         </w:rPr>
-        <w:t xml:space="preserve">: </w:t>
-      </w:r>
-      <w:r>
-        <w:rPr>
-          <w:rFonts w:ascii="맑은 고딕" w:eastAsia="맑은 고딕" w:hAnsi="맑은 고딕" w:cs="맑은 고딕"/>
-          <w:b/>
-          <w:bCs/>
-          <w:color w:val="0000FF"/>
-          <w:sz w:val="26"/>
-          <w:szCs w:val="26"/>
-        </w:rPr>
-        <w:t xml:space="preserve">엘리베이터형 자판기 </w:t>
-      </w:r>
-      <w:proofErr w:type="gramStart"/>
-      <w:r>
-        <w:rPr>
-          <w:rFonts w:ascii="맑은 고딕" w:eastAsia="맑은 고딕" w:hAnsi="맑은 고딕" w:cs="맑은 고딕"/>
-          <w:b/>
-          <w:bCs/>
-          <w:color w:val="0000FF"/>
-          <w:sz w:val="26"/>
-          <w:szCs w:val="26"/>
-        </w:rPr>
-        <w:t xml:space="preserve">시스템 </w:t>
-      </w:r>
-      <w:r>
-        <w:rPr>
-          <w:rFonts w:ascii="맑은 고딕" w:eastAsia="맑은 고딕" w:hAnsi="맑은 고딕" w:cs="맑은 고딕"/>
-          <w:b/>
-          <w:bCs/>
-          <w:color w:val="000000"/>
-          <w:sz w:val="26"/>
-          <w:szCs w:val="26"/>
-        </w:rPr>
         <w:t>]</w:t>
       </w:r>
-      <w:proofErr w:type="gramEnd"/>
     </w:p>
     <w:p>
       <w:pPr>
@@ -894,20 +868,8 @@
                 <w:sz w:val="26"/>
                 <w:szCs w:val="26"/>
               </w:rPr>
-              <w:t>1</w:t>
-            </w:r>
-            <w:proofErr w:type="spellStart"/>
-            <w:r>
-              <w:rPr>
-                <w:rFonts w:ascii="맑은 고딕" w:eastAsia="맑은 고딕" w:hAnsi="맑은 고딕" w:cs="맑은 고딕"/>
-                <w:b/>
-                <w:bCs/>
-                <w:sz w:val="26"/>
-                <w:szCs w:val="26"/>
-              </w:rPr>
-              <w:t>분반</w:t>
-            </w:r>
-            <w:proofErr w:type="spellEnd"/>
+              <w:t>1분반</w:t>
+            </w:r>
           </w:p>
         </w:tc>
       </w:tr>
@@ -999,7 +961,6 @@
                 <w:szCs w:val="26"/>
               </w:rPr>
             </w:pPr>
-            <w:proofErr w:type="spellStart"/>
             <w:r>
               <w:rPr>
                 <w:rFonts w:ascii="맑은 고딕" w:eastAsia="맑은 고딕" w:hAnsi="맑은 고딕" w:cs="맑은 고딕" w:hint="eastAsia"/>
@@ -1011,7 +972,6 @@
               </w:rPr>
               <w:t>말모이</w:t>
             </w:r>
-            <w:proofErr w:type="spellEnd"/>
           </w:p>
         </w:tc>
       </w:tr>
@@ -1222,7 +1182,6 @@
               </w:rPr>
               <w:t xml:space="preserve"> </w:t>
             </w:r>
-            <w:proofErr w:type="spellStart"/>
             <w:r>
               <w:rPr>
                 <w:rFonts w:ascii="맑은 고딕" w:eastAsia="맑은 고딕" w:hAnsi="맑은 고딕" w:cs="맑은 고딕" w:hint="eastAsia"/>
@@ -1234,7 +1193,6 @@
               </w:rPr>
               <w:t>임효진</w:t>
             </w:r>
-            <w:proofErr w:type="spellEnd"/>
           </w:p>
         </w:tc>
       </w:tr>
@@ -1448,21 +1406,8 @@
           <w:szCs w:val="32"/>
           <w:u w:val="single"/>
         </w:rPr>
-        <w:t xml:space="preserve">문서 제/개정 </w:t>
+        <w:t>문서 제/개정 이력표</w:t>
       </w:r>
-      <w:proofErr w:type="spellStart"/>
-      <w:r>
-        <w:rPr>
-          <w:rFonts w:ascii="맑은 고딕" w:eastAsia="맑은 고딕" w:hAnsi="맑은 고딕" w:cs="맑은 고딕"/>
-          <w:b/>
-          <w:bCs/>
-          <w:sz w:val="32"/>
-          <w:szCs w:val="32"/>
-          <w:u w:val="single"/>
-        </w:rPr>
-        <w:t>이력표</w:t>
-      </w:r>
-      <w:proofErr w:type="spellEnd"/>
     </w:p>
     <w:p>
       <w:pPr>
@@ -4114,25 +4059,7 @@
                 <w:sz w:val="20"/>
                 <w:szCs w:val="20"/>
               </w:rPr>
-              <w:t xml:space="preserve"> (</w:t>
-            </w:r>
-            <w:proofErr w:type="spellStart"/>
-            <w:r>
-              <w:rPr>
-                <w:rFonts w:ascii="맑은 고딕" w:eastAsia="맑은 고딕" w:hAnsi="맑은 고딕" w:cs="맑은 고딕"/>
-                <w:sz w:val="20"/>
-                <w:szCs w:val="20"/>
-              </w:rPr>
-              <w:t>서명</w:t>
-            </w:r>
-            <w:proofErr w:type="spellEnd"/>
-            <w:r>
-              <w:rPr>
-                <w:rFonts w:ascii="맑은 고딕" w:eastAsia="맑은 고딕" w:hAnsi="맑은 고딕" w:cs="맑은 고딕"/>
-                <w:sz w:val="20"/>
-                <w:szCs w:val="20"/>
-              </w:rPr>
-              <w:t>)</w:t>
+              <w:t xml:space="preserve"> (서명)</w:t>
             </w:r>
           </w:p>
         </w:tc>
@@ -4190,41 +4117,13 @@
                 <w:szCs w:val="20"/>
               </w:rPr>
             </w:pPr>
-            <w:proofErr w:type="spellStart"/>
             <w:r>
               <w:rPr>
                 <w:rFonts w:ascii="맑은 고딕" w:eastAsia="맑은 고딕" w:hAnsi="맑은 고딕" w:cs="맑은 고딕"/>
                 <w:sz w:val="20"/>
                 <w:szCs w:val="20"/>
               </w:rPr>
-              <w:t>고객대표</w:t>
-            </w:r>
-            <w:proofErr w:type="spellEnd"/>
-            <w:r>
-              <w:rPr>
-                <w:rFonts w:ascii="맑은 고딕" w:eastAsia="맑은 고딕" w:hAnsi="맑은 고딕" w:cs="맑은 고딕"/>
-                <w:sz w:val="20"/>
-                <w:szCs w:val="20"/>
-              </w:rPr>
-              <w:t xml:space="preserve"> (</w:t>
-            </w:r>
-            <w:proofErr w:type="spellStart"/>
-            <w:r>
-              <w:rPr>
-                <w:rFonts w:ascii="맑은 고딕" w:eastAsia="맑은 고딕" w:hAnsi="맑은 고딕" w:cs="맑은 고딕"/>
-                <w:sz w:val="20"/>
-                <w:szCs w:val="20"/>
-              </w:rPr>
-              <w:t>서명</w:t>
-            </w:r>
-            <w:proofErr w:type="spellEnd"/>
-            <w:r>
-              <w:rPr>
-                <w:rFonts w:ascii="맑은 고딕" w:eastAsia="맑은 고딕" w:hAnsi="맑은 고딕" w:cs="맑은 고딕"/>
-                <w:sz w:val="20"/>
-                <w:szCs w:val="20"/>
-              </w:rPr>
-              <w:t>)</w:t>
+              <w:t>고객대표 (서명)</w:t>
             </w:r>
           </w:p>
         </w:tc>
@@ -4385,25 +4284,7 @@
                 <w:sz w:val="20"/>
                 <w:szCs w:val="20"/>
               </w:rPr>
-              <w:t xml:space="preserve"> (</w:t>
-            </w:r>
-            <w:proofErr w:type="spellStart"/>
-            <w:r>
-              <w:rPr>
-                <w:rFonts w:ascii="맑은 고딕" w:eastAsia="맑은 고딕" w:hAnsi="맑은 고딕" w:cs="맑은 고딕"/>
-                <w:sz w:val="20"/>
-                <w:szCs w:val="20"/>
-              </w:rPr>
-              <w:t>서명</w:t>
-            </w:r>
-            <w:proofErr w:type="spellEnd"/>
-            <w:r>
-              <w:rPr>
-                <w:rFonts w:ascii="맑은 고딕" w:eastAsia="맑은 고딕" w:hAnsi="맑은 고딕" w:cs="맑은 고딕"/>
-                <w:sz w:val="20"/>
-                <w:szCs w:val="20"/>
-              </w:rPr>
-              <w:t>)</w:t>
+              <w:t xml:space="preserve"> (서명)</w:t>
             </w:r>
           </w:p>
         </w:tc>
@@ -4471,41 +4352,13 @@
                 <w:szCs w:val="20"/>
               </w:rPr>
             </w:pPr>
-            <w:proofErr w:type="spellStart"/>
             <w:r>
               <w:rPr>
                 <w:rFonts w:ascii="맑은 고딕" w:eastAsia="맑은 고딕" w:hAnsi="맑은 고딕" w:cs="맑은 고딕"/>
                 <w:sz w:val="20"/>
                 <w:szCs w:val="20"/>
               </w:rPr>
-              <w:t>고객대표</w:t>
-            </w:r>
-            <w:proofErr w:type="spellEnd"/>
-            <w:r>
-              <w:rPr>
-                <w:rFonts w:ascii="맑은 고딕" w:eastAsia="맑은 고딕" w:hAnsi="맑은 고딕" w:cs="맑은 고딕"/>
-                <w:sz w:val="20"/>
-                <w:szCs w:val="20"/>
-              </w:rPr>
-              <w:t xml:space="preserve"> (</w:t>
-            </w:r>
-            <w:proofErr w:type="spellStart"/>
-            <w:r>
-              <w:rPr>
-                <w:rFonts w:ascii="맑은 고딕" w:eastAsia="맑은 고딕" w:hAnsi="맑은 고딕" w:cs="맑은 고딕"/>
-                <w:sz w:val="20"/>
-                <w:szCs w:val="20"/>
-              </w:rPr>
-              <w:t>서명</w:t>
-            </w:r>
-            <w:proofErr w:type="spellEnd"/>
-            <w:r>
-              <w:rPr>
-                <w:rFonts w:ascii="맑은 고딕" w:eastAsia="맑은 고딕" w:hAnsi="맑은 고딕" w:cs="맑은 고딕"/>
-                <w:sz w:val="20"/>
-                <w:szCs w:val="20"/>
-              </w:rPr>
-              <w:t>)</w:t>
+              <w:t>고객대표 (서명)</w:t>
             </w:r>
           </w:p>
         </w:tc>
@@ -4537,7 +4390,6 @@
                 <w:szCs w:val="20"/>
               </w:rPr>
             </w:pPr>
-            <w:proofErr w:type="spellStart"/>
             <w:r>
               <w:rPr>
                 <w:rFonts w:ascii="맑은 고딕" w:eastAsia="맑은 고딕" w:hAnsi="맑은 고딕" w:cs="맑은 고딕"/>
@@ -4546,7 +4398,6 @@
               </w:rPr>
               <w:t>버전</w:t>
             </w:r>
-            <w:proofErr w:type="spellEnd"/>
           </w:p>
         </w:tc>
         <w:tc>
@@ -4572,7 +4423,6 @@
                 <w:szCs w:val="20"/>
               </w:rPr>
             </w:pPr>
-            <w:proofErr w:type="spellStart"/>
             <w:r>
               <w:rPr>
                 <w:rFonts w:ascii="맑은 고딕" w:eastAsia="맑은 고딕" w:hAnsi="맑은 고딕" w:cs="맑은 고딕"/>
@@ -4581,7 +4431,6 @@
               </w:rPr>
               <w:t>날짜</w:t>
             </w:r>
-            <w:proofErr w:type="spellEnd"/>
           </w:p>
         </w:tc>
         <w:tc>
@@ -4607,7 +4456,6 @@
                 <w:szCs w:val="20"/>
               </w:rPr>
             </w:pPr>
-            <w:proofErr w:type="spellStart"/>
             <w:r>
               <w:rPr>
                 <w:rFonts w:ascii="맑은 고딕" w:eastAsia="맑은 고딕" w:hAnsi="맑은 고딕" w:cs="맑은 고딕"/>
@@ -4616,7 +4464,6 @@
               </w:rPr>
               <w:t>작성자</w:t>
             </w:r>
-            <w:proofErr w:type="spellEnd"/>
           </w:p>
         </w:tc>
         <w:tc>
@@ -4648,18 +4495,8 @@
                 <w:sz w:val="20"/>
                 <w:szCs w:val="20"/>
               </w:rPr>
-              <w:t>제/</w:t>
-            </w:r>
-            <w:proofErr w:type="spellStart"/>
-            <w:r>
-              <w:rPr>
-                <w:rFonts w:ascii="맑은 고딕" w:eastAsia="맑은 고딕" w:hAnsi="맑은 고딕" w:cs="맑은 고딕"/>
-                <w:sz w:val="20"/>
-                <w:szCs w:val="20"/>
-              </w:rPr>
-              <w:t>개정사항</w:t>
-            </w:r>
-            <w:proofErr w:type="spellEnd"/>
+              <w:t>제/개정사항</w:t>
+            </w:r>
           </w:p>
         </w:tc>
         <w:tc>
@@ -4685,7 +4522,6 @@
                 <w:szCs w:val="20"/>
               </w:rPr>
             </w:pPr>
-            <w:proofErr w:type="spellStart"/>
             <w:r>
               <w:rPr>
                 <w:rFonts w:ascii="맑은 고딕" w:eastAsia="맑은 고딕" w:hAnsi="맑은 고딕" w:cs="맑은 고딕"/>
@@ -4694,7 +4530,6 @@
               </w:rPr>
               <w:t>확인</w:t>
             </w:r>
-            <w:proofErr w:type="spellEnd"/>
           </w:p>
         </w:tc>
       </w:tr>
@@ -5867,21 +5702,7 @@
         <w:rPr>
           <w:rFonts w:asciiTheme="majorHAnsi" w:eastAsiaTheme="majorHAnsi" w:hAnsiTheme="majorHAnsi" w:hint="eastAsia"/>
         </w:rPr>
-        <w:t>본 문서는 학번 기반 실시간 웹 채팅 시스템인 '</w:t>
-      </w:r>
-      <w:proofErr w:type="spellStart"/>
-      <w:r>
-        <w:rPr>
-          <w:rFonts w:asciiTheme="majorHAnsi" w:eastAsiaTheme="majorHAnsi" w:hAnsiTheme="majorHAnsi" w:hint="eastAsia"/>
-        </w:rPr>
-        <w:t>플래시톡</w:t>
-      </w:r>
-      <w:proofErr w:type="spellEnd"/>
-      <w:r>
-        <w:rPr>
-          <w:rFonts w:asciiTheme="majorHAnsi" w:eastAsiaTheme="majorHAnsi" w:hAnsiTheme="majorHAnsi" w:hint="eastAsia"/>
-        </w:rPr>
-        <w:t>'의 성공적인 개발을 위해 시스템이 제공해야 할 모든 기능적, 비기능적 요구사항을 명확하고 구체적으로 정의하는 것을 목적으로 한다. 앞서 정의된 문제 기술서를 바탕으로 도출된 시스템의 세부 요구사항을 문서화함으로써, 프로젝트 참여자 간의 상호 이해도를 높이고 개발 과정에서의 의사소통 기준을 확립한다. 또한, 향후 진행될 소프트웨어 아키텍처 설계, 컴포넌트 구현, 그리고 최종 시스템 테스트 및 검증 단계에서 요구사항 충족 여부를 평가하는 핵심 지침서로 활용된다.</w:t>
+        <w:t>본 문서는 학번 기반 실시간 웹 채팅 시스템인 '플래시톡'의 성공적인 개발을 위해 시스템이 제공해야 할 모든 기능적, 비기능적 요구사항을 명확하고 구체적으로 정의하는 것을 목적으로 한다. 앞서 정의된 문제 기술서를 바탕으로 도출된 시스템의 세부 요구사항을 문서화함으로써, 프로젝트 참여자 간의 상호 이해도를 높이고 개발 과정에서의 의사소통 기준을 확립한다. 또한, 향후 진행될 소프트웨어 아키텍처 설계, 컴포넌트 구현, 그리고 최종 시스템 테스트 및 검증 단계에서 요구사항 충족 여부를 평가하는 핵심 지침서로 활용된다.</w:t>
       </w:r>
     </w:p>
     <w:p>
@@ -5921,21 +5742,7 @@
         <w:rPr>
           <w:rFonts w:ascii="맑은 고딕" w:eastAsia="맑은 고딕" w:hAnsi="맑은 고딕" w:cs="맑은 고딕"/>
         </w:rPr>
-        <w:t xml:space="preserve">본 문서는 웹 채팅 시스템이 실제 운용 환경에서 충족해야 하는 세부 요구사항을 기능적 측면과 비기능적 측면으로 분류하여 상세히 기술한다. 기능적 요구사항에서는 학번 인증 처리 로직, 실시간 메시지 송수신, </w:t>
-      </w:r>
-      <w:proofErr w:type="spellStart"/>
-      <w:r>
-        <w:rPr>
-          <w:rFonts w:ascii="맑은 고딕" w:eastAsia="맑은 고딕" w:hAnsi="맑은 고딕" w:cs="맑은 고딕"/>
-        </w:rPr>
-        <w:t>채팅방</w:t>
-      </w:r>
-      <w:proofErr w:type="spellEnd"/>
-      <w:r>
-        <w:rPr>
-          <w:rFonts w:ascii="맑은 고딕" w:eastAsia="맑은 고딕" w:hAnsi="맑은 고딕" w:cs="맑은 고딕"/>
-        </w:rPr>
-        <w:t xml:space="preserve"> 생성 및 세션 관리 등 사용자 및 관리자 관점에서 시스템이 수행해야 하는 구체적인 동작을 정의한다. 비기능적 요구사항에서는 실시간 처리를 위한 통신 성능, 사용자 데이터 보호를 위한 보안 및 인증 정책, 시스템 가용성 및 사용자 인터페이스(UI/UX) 제약 사항 등을 다룬다. 아울러 각 요구사항에 대한 고유 식별자와 우선순위를 부여하여, 체계적이고 일관성 있는 프로젝트 관리가 이루어질 수 있도록 구성</w:t>
+        <w:t>본 문서는 웹 채팅 시스템이 실제 운용 환경에서 충족해야 하는 세부 요구사항을 기능적 측면과 비기능적 측면으로 분류하여 상세히 기술한다. 기능적 요구사항에서는 학번 인증 처리 로직, 실시간 메시지 송수신, 채팅방 생성 및 세션 관리 등 사용자 및 관리자 관점에서 시스템이 수행해야 하는 구체적인 동작을 정의한다. 비기능적 요구사항에서는 실시간 처리를 위한 통신 성능, 사용자 데이터 보호를 위한 보안 및 인증 정책, 시스템 가용성 및 사용자 인터페이스(UI/UX) 제약 사항 등을 다룬다. 아울러 각 요구사항에 대한 고유 식별자와 우선순위를 부여하여, 체계적이고 일관성 있는 프로젝트 관리가 이루어질 수 있도록 구성</w:t>
       </w:r>
       <w:r>
         <w:rPr>
@@ -6057,21 +5864,7 @@
         <w:rPr>
           <w:rFonts w:hint="eastAsia"/>
         </w:rPr>
-        <w:t xml:space="preserve">비즈니스 </w:t>
-      </w:r>
-      <w:proofErr w:type="spellStart"/>
-      <w:r>
-        <w:rPr>
-          <w:rFonts w:hint="eastAsia"/>
-        </w:rPr>
-        <w:t>유스케이스</w:t>
-      </w:r>
-      <w:proofErr w:type="spellEnd"/>
-      <w:r>
-        <w:rPr>
-          <w:rFonts w:hint="eastAsia"/>
-        </w:rPr>
-        <w:t xml:space="preserve"> 다이어그램</w:t>
+        <w:t>비즈니스 유스케이스 다이어그램</w:t>
       </w:r>
     </w:p>
     <w:tbl>
@@ -6226,21 +6019,7 @@
         <w:rPr>
           <w:rFonts w:hint="eastAsia"/>
         </w:rPr>
-        <w:t xml:space="preserve">비즈니스 </w:t>
-      </w:r>
-      <w:proofErr w:type="spellStart"/>
-      <w:r>
-        <w:rPr>
-          <w:rFonts w:hint="eastAsia"/>
-        </w:rPr>
-        <w:t>유스케이스</w:t>
-      </w:r>
-      <w:proofErr w:type="spellEnd"/>
-      <w:r>
-        <w:rPr>
-          <w:rFonts w:hint="eastAsia"/>
-        </w:rPr>
-        <w:t xml:space="preserve"> 목록</w:t>
+        <w:t>비즈니스 유스케이스 목록</w:t>
       </w:r>
     </w:p>
     <w:tbl>
@@ -6282,19 +6061,11 @@
                 <w:rFonts w:ascii="맑은 고딕" w:eastAsia="맑은 고딕" w:hAnsi="맑은 고딕" w:cs="맑은 고딕"/>
               </w:rPr>
             </w:pPr>
-            <w:proofErr w:type="spellStart"/>
-            <w:r>
-              <w:rPr>
-                <w:rFonts w:ascii="맑은 고딕" w:eastAsia="맑은 고딕" w:hAnsi="맑은 고딕" w:cs="맑은 고딕"/>
-              </w:rPr>
-              <w:t>유스케이스</w:t>
-            </w:r>
-            <w:proofErr w:type="spellEnd"/>
-            <w:r>
-              <w:rPr>
-                <w:rFonts w:ascii="맑은 고딕" w:eastAsia="맑은 고딕" w:hAnsi="맑은 고딕" w:cs="맑은 고딕"/>
-              </w:rPr>
-              <w:t xml:space="preserve"> ID</w:t>
+            <w:r>
+              <w:rPr>
+                <w:rFonts w:ascii="맑은 고딕" w:eastAsia="맑은 고딕" w:hAnsi="맑은 고딕" w:cs="맑은 고딕"/>
+              </w:rPr>
+              <w:t>유스케이스 ID</w:t>
             </w:r>
           </w:p>
         </w:tc>
@@ -6309,19 +6080,11 @@
                 <w:rFonts w:ascii="맑은 고딕" w:eastAsia="맑은 고딕" w:hAnsi="맑은 고딕" w:cs="맑은 고딕"/>
               </w:rPr>
             </w:pPr>
-            <w:proofErr w:type="spellStart"/>
-            <w:r>
-              <w:rPr>
-                <w:rFonts w:ascii="맑은 고딕" w:eastAsia="맑은 고딕" w:hAnsi="맑은 고딕" w:cs="맑은 고딕"/>
-              </w:rPr>
-              <w:t>유스케이스</w:t>
-            </w:r>
-            <w:proofErr w:type="spellEnd"/>
-            <w:r>
-              <w:rPr>
-                <w:rFonts w:ascii="맑은 고딕" w:eastAsia="맑은 고딕" w:hAnsi="맑은 고딕" w:cs="맑은 고딕"/>
-              </w:rPr>
-              <w:t xml:space="preserve"> 명</w:t>
+            <w:r>
+              <w:rPr>
+                <w:rFonts w:ascii="맑은 고딕" w:eastAsia="맑은 고딕" w:hAnsi="맑은 고딕" w:cs="맑은 고딕"/>
+              </w:rPr>
+              <w:t>유스케이스 명</w:t>
             </w:r>
           </w:p>
         </w:tc>
@@ -6340,16 +6103,8 @@
               <w:rPr>
                 <w:rFonts w:ascii="맑은 고딕" w:eastAsia="맑은 고딕" w:hAnsi="맑은 고딕" w:cs="맑은 고딕"/>
               </w:rPr>
-              <w:t xml:space="preserve">주요 </w:t>
-            </w:r>
-            <w:proofErr w:type="spellStart"/>
-            <w:r>
-              <w:rPr>
-                <w:rFonts w:ascii="맑은 고딕" w:eastAsia="맑은 고딕" w:hAnsi="맑은 고딕" w:cs="맑은 고딕"/>
-              </w:rPr>
-              <w:t>액터</w:t>
-            </w:r>
-            <w:proofErr w:type="spellEnd"/>
+              <w:t>주요 액터</w:t>
+            </w:r>
           </w:p>
         </w:tc>
         <w:tc>
@@ -7130,16 +6885,8 @@
               <w:rPr>
                 <w:rFonts w:ascii="맑은 고딕" w:eastAsia="맑은 고딕" w:hAnsi="맑은 고딕" w:cs="맑은 고딕" w:hint="eastAsia"/>
               </w:rPr>
-              <w:t xml:space="preserve">AI </w:t>
-            </w:r>
-            <w:proofErr w:type="spellStart"/>
-            <w:r>
-              <w:rPr>
-                <w:rFonts w:ascii="맑은 고딕" w:eastAsia="맑은 고딕" w:hAnsi="맑은 고딕" w:cs="맑은 고딕" w:hint="eastAsia"/>
-              </w:rPr>
-              <w:t>챗봇</w:t>
-            </w:r>
-            <w:proofErr w:type="spellEnd"/>
+              <w:t>AI 챗봇</w:t>
+            </w:r>
           </w:p>
         </w:tc>
         <w:tc>
@@ -7426,21 +7173,7 @@
         <w:rPr>
           <w:rFonts w:hint="eastAsia"/>
         </w:rPr>
-        <w:t xml:space="preserve">비즈니스 </w:t>
-      </w:r>
-      <w:proofErr w:type="spellStart"/>
-      <w:r>
-        <w:rPr>
-          <w:rFonts w:hint="eastAsia"/>
-        </w:rPr>
-        <w:t>유스케이스</w:t>
-      </w:r>
-      <w:proofErr w:type="spellEnd"/>
-      <w:r>
-        <w:rPr>
-          <w:rFonts w:hint="eastAsia"/>
-        </w:rPr>
-        <w:t xml:space="preserve"> </w:t>
+        <w:t xml:space="preserve">비즈니스 유스케이스 </w:t>
       </w:r>
       <w:r>
         <w:rPr>
@@ -7648,17 +7381,8 @@
                 <w:rFonts w:asciiTheme="minorHAnsi" w:eastAsiaTheme="minorHAnsi" w:hAnsiTheme="minorHAnsi"/>
                 <w:b/>
               </w:rPr>
-              <w:t xml:space="preserve">주요 </w:t>
-            </w:r>
-            <w:proofErr w:type="spellStart"/>
-            <w:r>
-              <w:rPr>
-                <w:rFonts w:asciiTheme="minorHAnsi" w:eastAsiaTheme="minorHAnsi" w:hAnsiTheme="minorHAnsi"/>
-                <w:b/>
-              </w:rPr>
-              <w:t>액터</w:t>
-            </w:r>
-            <w:proofErr w:type="spellEnd"/>
+              <w:t>주요 액터</w:t>
+            </w:r>
           </w:p>
         </w:tc>
         <w:tc>
@@ -8250,17 +7974,8 @@
                 <w:b/>
               </w:rPr>
               <w:lastRenderedPageBreak/>
-              <w:t xml:space="preserve">주요 </w:t>
-            </w:r>
-            <w:proofErr w:type="spellStart"/>
-            <w:r>
-              <w:rPr>
-                <w:rFonts w:asciiTheme="minorHAnsi" w:eastAsiaTheme="minorHAnsi" w:hAnsiTheme="minorHAnsi"/>
-                <w:b/>
-              </w:rPr>
-              <w:t>액터</w:t>
-            </w:r>
-            <w:proofErr w:type="spellEnd"/>
+              <w:t>주요 액터</w:t>
+            </w:r>
           </w:p>
         </w:tc>
         <w:tc>
@@ -8882,17 +8597,8 @@
                 <w:rFonts w:asciiTheme="minorHAnsi" w:eastAsiaTheme="minorHAnsi" w:hAnsiTheme="minorHAnsi"/>
                 <w:b/>
               </w:rPr>
-              <w:t xml:space="preserve">주요 </w:t>
-            </w:r>
-            <w:proofErr w:type="spellStart"/>
-            <w:r>
-              <w:rPr>
-                <w:rFonts w:asciiTheme="minorHAnsi" w:eastAsiaTheme="minorHAnsi" w:hAnsiTheme="minorHAnsi"/>
-                <w:b/>
-              </w:rPr>
-              <w:t>액터</w:t>
-            </w:r>
-            <w:proofErr w:type="spellEnd"/>
+              <w:t>주요 액터</w:t>
+            </w:r>
           </w:p>
         </w:tc>
         <w:tc>
@@ -9457,17 +9163,8 @@
                 <w:rFonts w:asciiTheme="minorHAnsi" w:eastAsiaTheme="minorHAnsi" w:hAnsiTheme="minorHAnsi"/>
                 <w:b/>
               </w:rPr>
-              <w:t xml:space="preserve">주요 </w:t>
-            </w:r>
-            <w:proofErr w:type="spellStart"/>
-            <w:r>
-              <w:rPr>
-                <w:rFonts w:asciiTheme="minorHAnsi" w:eastAsiaTheme="minorHAnsi" w:hAnsiTheme="minorHAnsi"/>
-                <w:b/>
-              </w:rPr>
-              <w:t>액터</w:t>
-            </w:r>
-            <w:proofErr w:type="spellEnd"/>
+              <w:t>주요 액터</w:t>
+            </w:r>
           </w:p>
         </w:tc>
         <w:tc>
@@ -9990,17 +9687,8 @@
                 <w:rFonts w:asciiTheme="minorHAnsi" w:eastAsiaTheme="minorHAnsi" w:hAnsiTheme="minorHAnsi"/>
                 <w:b/>
               </w:rPr>
-              <w:t xml:space="preserve">주요 </w:t>
-            </w:r>
-            <w:proofErr w:type="spellStart"/>
-            <w:r>
-              <w:rPr>
-                <w:rFonts w:asciiTheme="minorHAnsi" w:eastAsiaTheme="minorHAnsi" w:hAnsiTheme="minorHAnsi"/>
-                <w:b/>
-              </w:rPr>
-              <w:t>액터</w:t>
-            </w:r>
-            <w:proofErr w:type="spellEnd"/>
+              <w:t>주요 액터</w:t>
+            </w:r>
           </w:p>
         </w:tc>
         <w:tc>
@@ -10476,17 +10164,8 @@
                 <w:rFonts w:asciiTheme="minorHAnsi" w:eastAsiaTheme="minorHAnsi" w:hAnsiTheme="minorHAnsi"/>
                 <w:b/>
               </w:rPr>
-              <w:t xml:space="preserve">주요 </w:t>
-            </w:r>
-            <w:proofErr w:type="spellStart"/>
-            <w:r>
-              <w:rPr>
-                <w:rFonts w:asciiTheme="minorHAnsi" w:eastAsiaTheme="minorHAnsi" w:hAnsiTheme="minorHAnsi"/>
-                <w:b/>
-              </w:rPr>
-              <w:t>액터</w:t>
-            </w:r>
-            <w:proofErr w:type="spellEnd"/>
+              <w:t>주요 액터</w:t>
+            </w:r>
           </w:p>
         </w:tc>
         <w:tc>
@@ -10839,19 +10518,11 @@
               </w:rPr>
               <w:t>“</w:t>
             </w:r>
-            <w:proofErr w:type="gramStart"/>
             <w:r>
               <w:rPr>
                 <w:rFonts w:asciiTheme="minorHAnsi" w:eastAsiaTheme="minorHAnsi" w:hAnsiTheme="minorHAnsi" w:hint="eastAsia"/>
               </w:rPr>
-              <w:t>지원 되지</w:t>
-            </w:r>
-            <w:proofErr w:type="gramEnd"/>
-            <w:r>
-              <w:rPr>
-                <w:rFonts w:asciiTheme="minorHAnsi" w:eastAsiaTheme="minorHAnsi" w:hAnsiTheme="minorHAnsi" w:hint="eastAsia"/>
-              </w:rPr>
-              <w:t xml:space="preserve"> 않는 파일</w:t>
+              <w:t>지원 되지 않는 파일</w:t>
             </w:r>
             <w:r>
               <w:rPr>
@@ -11145,17 +10816,8 @@
                 <w:rFonts w:asciiTheme="minorHAnsi" w:eastAsiaTheme="minorHAnsi" w:hAnsiTheme="minorHAnsi"/>
                 <w:b/>
               </w:rPr>
-              <w:t xml:space="preserve">주요 </w:t>
-            </w:r>
-            <w:proofErr w:type="spellStart"/>
-            <w:r>
-              <w:rPr>
-                <w:rFonts w:asciiTheme="minorHAnsi" w:eastAsiaTheme="minorHAnsi" w:hAnsiTheme="minorHAnsi"/>
-                <w:b/>
-              </w:rPr>
-              <w:t>액터</w:t>
-            </w:r>
-            <w:proofErr w:type="spellEnd"/>
+              <w:t>주요 액터</w:t>
+            </w:r>
           </w:p>
         </w:tc>
         <w:tc>
@@ -11789,17 +11451,8 @@
                 <w:rFonts w:asciiTheme="minorHAnsi" w:eastAsiaTheme="minorHAnsi" w:hAnsiTheme="minorHAnsi"/>
                 <w:b/>
               </w:rPr>
-              <w:t xml:space="preserve">주요 </w:t>
-            </w:r>
-            <w:proofErr w:type="spellStart"/>
-            <w:r>
-              <w:rPr>
-                <w:rFonts w:asciiTheme="minorHAnsi" w:eastAsiaTheme="minorHAnsi" w:hAnsiTheme="minorHAnsi"/>
-                <w:b/>
-              </w:rPr>
-              <w:t>액터</w:t>
-            </w:r>
-            <w:proofErr w:type="spellEnd"/>
+              <w:t>주요 액터</w:t>
+            </w:r>
           </w:p>
         </w:tc>
         <w:tc>
@@ -12365,17 +12018,8 @@
                 <w:rFonts w:asciiTheme="minorHAnsi" w:eastAsiaTheme="minorHAnsi" w:hAnsiTheme="minorHAnsi"/>
                 <w:b/>
               </w:rPr>
-              <w:t xml:space="preserve">주요 </w:t>
-            </w:r>
-            <w:proofErr w:type="spellStart"/>
-            <w:r>
-              <w:rPr>
-                <w:rFonts w:asciiTheme="minorHAnsi" w:eastAsiaTheme="minorHAnsi" w:hAnsiTheme="minorHAnsi"/>
-                <w:b/>
-              </w:rPr>
-              <w:t>액터</w:t>
-            </w:r>
-            <w:proofErr w:type="spellEnd"/>
+              <w:t>주요 액터</w:t>
+            </w:r>
           </w:p>
         </w:tc>
         <w:tc>
@@ -12684,27 +12328,43 @@
               <w:rPr>
                 <w:rFonts w:asciiTheme="minorHAnsi" w:eastAsiaTheme="minorHAnsi" w:hAnsiTheme="minorHAnsi" w:hint="eastAsia"/>
               </w:rPr>
-              <w:t xml:space="preserve">해당 회원을 </w:t>
-            </w:r>
-            <w:proofErr w:type="spellStart"/>
+              <w:t>해당 회원을 탈퇴</w:t>
+            </w:r>
+            <w:r>
+              <w:rPr>
+                <w:rFonts w:asciiTheme="minorHAnsi" w:eastAsiaTheme="minorHAnsi" w:hAnsiTheme="minorHAnsi"/>
+              </w:rPr>
+              <w:t>시키겠습니까</w:t>
+            </w:r>
             <w:r>
               <w:rPr>
                 <w:rFonts w:asciiTheme="minorHAnsi" w:eastAsiaTheme="minorHAnsi" w:hAnsiTheme="minorHAnsi" w:hint="eastAsia"/>
               </w:rPr>
-              <w:t>탈퇴</w:t>
-            </w:r>
-            <w:r>
-              <w:rPr>
-                <w:rFonts w:asciiTheme="minorHAnsi" w:eastAsiaTheme="minorHAnsi" w:hAnsiTheme="minorHAnsi"/>
-              </w:rPr>
-              <w:t>시키겠습니까</w:t>
-            </w:r>
-            <w:proofErr w:type="spellEnd"/>
+              <w:t>?</w:t>
+            </w:r>
+            <w:r>
+              <w:rPr>
+                <w:rFonts w:asciiTheme="minorHAnsi" w:eastAsiaTheme="minorHAnsi" w:hAnsiTheme="minorHAnsi"/>
+              </w:rPr>
+              <w:t>”</w:t>
+            </w:r>
             <w:r>
               <w:rPr>
                 <w:rFonts w:asciiTheme="minorHAnsi" w:eastAsiaTheme="minorHAnsi" w:hAnsiTheme="minorHAnsi" w:hint="eastAsia"/>
               </w:rPr>
-              <w:t>?</w:t>
+              <w:t xml:space="preserve"> 메시지 출력 후 </w:t>
+            </w:r>
+            <w:r>
+              <w:rPr>
+                <w:rFonts w:asciiTheme="minorHAnsi" w:eastAsiaTheme="minorHAnsi" w:hAnsiTheme="minorHAnsi"/>
+              </w:rPr>
+              <w:t>“</w:t>
+            </w:r>
+            <w:r>
+              <w:rPr>
+                <w:rFonts w:asciiTheme="minorHAnsi" w:eastAsiaTheme="minorHAnsi" w:hAnsiTheme="minorHAnsi" w:hint="eastAsia"/>
+              </w:rPr>
+              <w:t>예</w:t>
             </w:r>
             <w:r>
               <w:rPr>
@@ -12716,7 +12376,7 @@
               <w:rPr>
                 <w:rFonts w:asciiTheme="minorHAnsi" w:eastAsiaTheme="minorHAnsi" w:hAnsiTheme="minorHAnsi" w:hint="eastAsia"/>
               </w:rPr>
-              <w:t xml:space="preserve"> 메시지 출력 후 </w:t>
+              <w:t xml:space="preserve">를 눌러 회원을 탈퇴 시키거나, </w:t>
             </w:r>
             <w:r>
               <w:rPr>
@@ -12728,7 +12388,7 @@
               <w:rPr>
                 <w:rFonts w:asciiTheme="minorHAnsi" w:eastAsiaTheme="minorHAnsi" w:hAnsiTheme="minorHAnsi" w:hint="eastAsia"/>
               </w:rPr>
-              <w:t>예</w:t>
+              <w:t>아니요</w:t>
             </w:r>
             <w:r>
               <w:rPr>
@@ -12736,65 +12396,11 @@
               </w:rPr>
               <w:t>”</w:t>
             </w:r>
-            <w:proofErr w:type="spellStart"/>
             <w:r>
               <w:rPr>
                 <w:rFonts w:asciiTheme="minorHAnsi" w:eastAsiaTheme="minorHAnsi" w:hAnsiTheme="minorHAnsi" w:hint="eastAsia"/>
               </w:rPr>
-              <w:t>를</w:t>
-            </w:r>
-            <w:proofErr w:type="spellEnd"/>
-            <w:r>
-              <w:rPr>
-                <w:rFonts w:asciiTheme="minorHAnsi" w:eastAsiaTheme="minorHAnsi" w:hAnsiTheme="minorHAnsi" w:hint="eastAsia"/>
-              </w:rPr>
-              <w:t xml:space="preserve"> 눌러 회원을 </w:t>
-            </w:r>
-            <w:proofErr w:type="gramStart"/>
-            <w:r>
-              <w:rPr>
-                <w:rFonts w:asciiTheme="minorHAnsi" w:eastAsiaTheme="minorHAnsi" w:hAnsiTheme="minorHAnsi" w:hint="eastAsia"/>
-              </w:rPr>
-              <w:t>탈퇴 시키거나</w:t>
-            </w:r>
-            <w:proofErr w:type="gramEnd"/>
-            <w:r>
-              <w:rPr>
-                <w:rFonts w:asciiTheme="minorHAnsi" w:eastAsiaTheme="minorHAnsi" w:hAnsiTheme="minorHAnsi" w:hint="eastAsia"/>
-              </w:rPr>
-              <w:t xml:space="preserve">, </w:t>
-            </w:r>
-            <w:r>
-              <w:rPr>
-                <w:rFonts w:asciiTheme="minorHAnsi" w:eastAsiaTheme="minorHAnsi" w:hAnsiTheme="minorHAnsi"/>
-              </w:rPr>
-              <w:t>“</w:t>
-            </w:r>
-            <w:r>
-              <w:rPr>
-                <w:rFonts w:asciiTheme="minorHAnsi" w:eastAsiaTheme="minorHAnsi" w:hAnsiTheme="minorHAnsi" w:hint="eastAsia"/>
-              </w:rPr>
-              <w:t>아니요</w:t>
-            </w:r>
-            <w:r>
-              <w:rPr>
-                <w:rFonts w:asciiTheme="minorHAnsi" w:eastAsiaTheme="minorHAnsi" w:hAnsiTheme="minorHAnsi"/>
-              </w:rPr>
-              <w:t>”</w:t>
-            </w:r>
-            <w:proofErr w:type="spellStart"/>
-            <w:r>
-              <w:rPr>
-                <w:rFonts w:asciiTheme="minorHAnsi" w:eastAsiaTheme="minorHAnsi" w:hAnsiTheme="minorHAnsi" w:hint="eastAsia"/>
-              </w:rPr>
-              <w:t>를</w:t>
-            </w:r>
-            <w:proofErr w:type="spellEnd"/>
-            <w:r>
-              <w:rPr>
-                <w:rFonts w:asciiTheme="minorHAnsi" w:eastAsiaTheme="minorHAnsi" w:hAnsiTheme="minorHAnsi" w:hint="eastAsia"/>
-              </w:rPr>
-              <w:t xml:space="preserve"> 눌러 탈퇴를 취소한다.</w:t>
+              <w:t>를 눌러 탈퇴를 취소한다.</w:t>
             </w:r>
           </w:p>
         </w:tc>
@@ -15214,7 +14820,6 @@
           <w:szCs w:val="22"/>
         </w:rPr>
       </w:pPr>
-      <w:proofErr w:type="spellStart"/>
       <w:r>
         <w:rPr>
           <w:rFonts w:hint="eastAsia"/>
@@ -15223,7 +14828,6 @@
         </w:rPr>
         <w:t>플래시톡</w:t>
       </w:r>
-      <w:proofErr w:type="spellEnd"/>
       <w:r>
         <w:rPr>
           <w:sz w:val="22"/>
@@ -15290,14 +14894,12 @@
                 <w:rFonts w:ascii="맑은 고딕" w:eastAsia="맑은 고딕" w:hAnsi="맑은 고딕" w:cs="맑은 고딕"/>
               </w:rPr>
             </w:pPr>
-            <w:proofErr w:type="spellStart"/>
             <w:r>
               <w:rPr>
                 <w:rFonts w:ascii="맑은 고딕" w:eastAsia="맑은 고딕" w:hAnsi="맑은 고딕" w:cs="맑은 고딕"/>
               </w:rPr>
               <w:t>객체명</w:t>
             </w:r>
-            <w:proofErr w:type="spellEnd"/>
           </w:p>
         </w:tc>
         <w:tc>
@@ -15989,21 +15591,7 @@
               <w:rPr>
                 <w:rFonts w:ascii="맑은 고딕" w:eastAsia="맑은 고딕" w:hAnsi="맑은 고딕" w:cs="맑은 고딕" w:hint="eastAsia"/>
               </w:rPr>
-              <w:t xml:space="preserve"> AI </w:t>
-            </w:r>
-            <w:proofErr w:type="spellStart"/>
-            <w:r>
-              <w:rPr>
-                <w:rFonts w:ascii="맑은 고딕" w:eastAsia="맑은 고딕" w:hAnsi="맑은 고딕" w:cs="맑은 고딕" w:hint="eastAsia"/>
-              </w:rPr>
-              <w:t>챗봇</w:t>
-            </w:r>
-            <w:proofErr w:type="spellEnd"/>
-            <w:r>
-              <w:rPr>
-                <w:rFonts w:ascii="맑은 고딕" w:eastAsia="맑은 고딕" w:hAnsi="맑은 고딕" w:cs="맑은 고딕" w:hint="eastAsia"/>
-              </w:rPr>
-              <w:t xml:space="preserve"> 시스템, 메시지 중계 시스템</w:t>
+              <w:t xml:space="preserve"> AI 챗봇 시스템, 메시지 중계 시스템</w:t>
             </w:r>
           </w:p>
         </w:tc>
@@ -16024,7 +15612,6 @@
           <w:szCs w:val="22"/>
         </w:rPr>
       </w:pPr>
-      <w:proofErr w:type="spellStart"/>
       <w:r>
         <w:rPr>
           <w:rFonts w:hint="eastAsia"/>
@@ -16033,7 +15620,6 @@
         </w:rPr>
         <w:t>플래시톡</w:t>
       </w:r>
-      <w:proofErr w:type="spellEnd"/>
       <w:r>
         <w:rPr>
           <w:sz w:val="22"/>
@@ -16100,14 +15686,12 @@
                 <w:rFonts w:ascii="맑은 고딕" w:eastAsia="맑은 고딕" w:hAnsi="맑은 고딕" w:cs="맑은 고딕"/>
               </w:rPr>
             </w:pPr>
-            <w:proofErr w:type="spellStart"/>
             <w:r>
               <w:rPr>
                 <w:rFonts w:ascii="맑은 고딕" w:eastAsia="맑은 고딕" w:hAnsi="맑은 고딕" w:cs="맑은 고딕"/>
               </w:rPr>
               <w:t>워커명</w:t>
             </w:r>
-            <w:proofErr w:type="spellEnd"/>
           </w:p>
         </w:tc>
         <w:tc>
@@ -16568,21 +16152,7 @@
               <w:rPr>
                 <w:rFonts w:ascii="맑은 고딕" w:eastAsia="맑은 고딕" w:hAnsi="맑은 고딕" w:cs="맑은 고딕" w:hint="eastAsia"/>
               </w:rPr>
-              <w:t xml:space="preserve">AI </w:t>
-            </w:r>
-            <w:proofErr w:type="spellStart"/>
-            <w:r>
-              <w:rPr>
-                <w:rFonts w:ascii="맑은 고딕" w:eastAsia="맑은 고딕" w:hAnsi="맑은 고딕" w:cs="맑은 고딕" w:hint="eastAsia"/>
-              </w:rPr>
-              <w:t>챗봇</w:t>
-            </w:r>
-            <w:proofErr w:type="spellEnd"/>
-            <w:r>
-              <w:rPr>
-                <w:rFonts w:ascii="맑은 고딕" w:eastAsia="맑은 고딕" w:hAnsi="맑은 고딕" w:cs="맑은 고딕" w:hint="eastAsia"/>
-              </w:rPr>
-              <w:t xml:space="preserve"> 시스템</w:t>
+              <w:t>AI 챗봇 시스템</w:t>
             </w:r>
           </w:p>
         </w:tc>
@@ -16742,21 +16312,7 @@
               <w:rPr>
                 <w:rFonts w:ascii="맑은 고딕" w:eastAsia="맑은 고딕" w:hAnsi="맑은 고딕" w:cs="맑은 고딕" w:hint="eastAsia"/>
               </w:rPr>
-              <w:t xml:space="preserve">로그 감사 시스템이 제공한 데이터에 따라 실시간 </w:t>
-            </w:r>
-            <w:proofErr w:type="spellStart"/>
-            <w:r>
-              <w:rPr>
-                <w:rFonts w:ascii="맑은 고딕" w:eastAsia="맑은 고딕" w:hAnsi="맑은 고딕" w:cs="맑은 고딕" w:hint="eastAsia"/>
-              </w:rPr>
-              <w:t>접속자</w:t>
-            </w:r>
-            <w:proofErr w:type="spellEnd"/>
-            <w:r>
-              <w:rPr>
-                <w:rFonts w:ascii="맑은 고딕" w:eastAsia="맑은 고딕" w:hAnsi="맑은 고딕" w:cs="맑은 고딕" w:hint="eastAsia"/>
-              </w:rPr>
-              <w:t xml:space="preserve"> 수, 활성 대화방 수, 에러 여부 등을 시각화하고, 시스템에서 발생한 활동 이력, 에러 로그 추적 및 제어를 수행한다. </w:t>
+              <w:t xml:space="preserve">로그 감사 시스템이 제공한 데이터에 따라 실시간 접속자 수, 활성 대화방 수, 에러 여부 등을 시각화하고, 시스템에서 발생한 활동 이력, 에러 로그 추적 및 제어를 수행한다. </w:t>
             </w:r>
           </w:p>
         </w:tc>
@@ -16843,7 +16399,6 @@
           <w:szCs w:val="22"/>
         </w:rPr>
       </w:pPr>
-      <w:proofErr w:type="spellStart"/>
       <w:r>
         <w:rPr>
           <w:rFonts w:hint="eastAsia"/>
@@ -16852,7 +16407,6 @@
         </w:rPr>
         <w:t>플래시톡</w:t>
       </w:r>
-      <w:proofErr w:type="spellEnd"/>
       <w:r>
         <w:rPr>
           <w:sz w:val="22"/>
@@ -16927,14 +16481,12 @@
                 <w:rFonts w:ascii="맑은 고딕" w:eastAsia="맑은 고딕" w:hAnsi="맑은 고딕" w:cs="맑은 고딕"/>
               </w:rPr>
             </w:pPr>
-            <w:proofErr w:type="spellStart"/>
             <w:r>
               <w:rPr>
                 <w:rFonts w:ascii="맑은 고딕" w:eastAsia="맑은 고딕" w:hAnsi="맑은 고딕" w:cs="맑은 고딕"/>
               </w:rPr>
               <w:t>객체명</w:t>
             </w:r>
-            <w:proofErr w:type="spellEnd"/>
           </w:p>
         </w:tc>
         <w:tc>
@@ -17319,21 +16871,7 @@
               <w:rPr>
                 <w:rFonts w:ascii="맑은 고딕" w:eastAsia="맑은 고딕" w:hAnsi="맑은 고딕" w:cs="맑은 고딕" w:hint="eastAsia"/>
               </w:rPr>
-              <w:t xml:space="preserve">사용자가 입력한 정보에 따라 외부 지도 연계 시스템에서 가져온 해당 위치의 </w:t>
-            </w:r>
-            <w:proofErr w:type="spellStart"/>
-            <w:r>
-              <w:rPr>
-                <w:rFonts w:ascii="맑은 고딕" w:eastAsia="맑은 고딕" w:hAnsi="맑은 고딕" w:cs="맑은 고딕" w:hint="eastAsia"/>
-              </w:rPr>
-              <w:t>장소명</w:t>
-            </w:r>
-            <w:proofErr w:type="spellEnd"/>
-            <w:r>
-              <w:rPr>
-                <w:rFonts w:ascii="맑은 고딕" w:eastAsia="맑은 고딕" w:hAnsi="맑은 고딕" w:cs="맑은 고딕" w:hint="eastAsia"/>
-              </w:rPr>
-              <w:t>, 전체 주소, 위도와 경도, 웹 링크, 지도 미리보기 이미지 주소 등을 기록하는 객체.</w:t>
+              <w:t>사용자가 입력한 정보에 따라 외부 지도 연계 시스템에서 가져온 해당 위치의 장소명, 전체 주소, 위도와 경도, 웹 링크, 지도 미리보기 이미지 주소 등을 기록하는 객체.</w:t>
             </w:r>
           </w:p>
         </w:tc>
@@ -17590,19 +17128,11 @@
       <w:r>
         <w:t xml:space="preserve">.1 </w:t>
       </w:r>
-      <w:proofErr w:type="spellStart"/>
       <w:r>
         <w:rPr>
           <w:rFonts w:hint="eastAsia"/>
         </w:rPr>
-        <w:t>유스케이스</w:t>
-      </w:r>
-      <w:proofErr w:type="spellEnd"/>
-      <w:r>
-        <w:rPr>
-          <w:rFonts w:hint="eastAsia"/>
-        </w:rPr>
-        <w:t xml:space="preserve"> 다이어그램</w:t>
+        <w:t>유스케이스 다이어그램</w:t>
       </w:r>
     </w:p>
     <w:tbl>
@@ -17748,19 +17278,11 @@
       <w:r>
         <w:t xml:space="preserve"> </w:t>
       </w:r>
-      <w:proofErr w:type="spellStart"/>
       <w:r>
         <w:rPr>
           <w:rFonts w:hint="eastAsia"/>
         </w:rPr>
-        <w:t>유스케이스</w:t>
-      </w:r>
-      <w:proofErr w:type="spellEnd"/>
-      <w:r>
-        <w:rPr>
-          <w:rFonts w:hint="eastAsia"/>
-        </w:rPr>
-        <w:t xml:space="preserve"> 목록</w:t>
+        <w:t>유스케이스 목록</w:t>
       </w:r>
     </w:p>
     <w:tbl>
@@ -17803,19 +17325,11 @@
                 <w:rFonts w:ascii="맑은 고딕" w:eastAsia="맑은 고딕" w:hAnsi="맑은 고딕" w:cs="맑은 고딕"/>
               </w:rPr>
             </w:pPr>
-            <w:proofErr w:type="spellStart"/>
-            <w:r>
-              <w:rPr>
-                <w:rFonts w:ascii="맑은 고딕" w:eastAsia="맑은 고딕" w:hAnsi="맑은 고딕" w:cs="맑은 고딕"/>
-              </w:rPr>
-              <w:t>유스케이스</w:t>
-            </w:r>
-            <w:proofErr w:type="spellEnd"/>
-            <w:r>
-              <w:rPr>
-                <w:rFonts w:ascii="맑은 고딕" w:eastAsia="맑은 고딕" w:hAnsi="맑은 고딕" w:cs="맑은 고딕"/>
-              </w:rPr>
-              <w:t xml:space="preserve"> ID</w:t>
+            <w:r>
+              <w:rPr>
+                <w:rFonts w:ascii="맑은 고딕" w:eastAsia="맑은 고딕" w:hAnsi="맑은 고딕" w:cs="맑은 고딕"/>
+              </w:rPr>
+              <w:t>유스케이스 ID</w:t>
             </w:r>
           </w:p>
         </w:tc>
@@ -17831,19 +17345,11 @@
                 <w:rFonts w:ascii="맑은 고딕" w:eastAsia="맑은 고딕" w:hAnsi="맑은 고딕" w:cs="맑은 고딕"/>
               </w:rPr>
             </w:pPr>
-            <w:proofErr w:type="spellStart"/>
-            <w:r>
-              <w:rPr>
-                <w:rFonts w:ascii="맑은 고딕" w:eastAsia="맑은 고딕" w:hAnsi="맑은 고딕" w:cs="맑은 고딕"/>
-              </w:rPr>
-              <w:t>유스케이스</w:t>
-            </w:r>
-            <w:proofErr w:type="spellEnd"/>
-            <w:r>
-              <w:rPr>
-                <w:rFonts w:ascii="맑은 고딕" w:eastAsia="맑은 고딕" w:hAnsi="맑은 고딕" w:cs="맑은 고딕"/>
-              </w:rPr>
-              <w:t xml:space="preserve"> 명</w:t>
+            <w:r>
+              <w:rPr>
+                <w:rFonts w:ascii="맑은 고딕" w:eastAsia="맑은 고딕" w:hAnsi="맑은 고딕" w:cs="맑은 고딕"/>
+              </w:rPr>
+              <w:t>유스케이스 명</w:t>
             </w:r>
           </w:p>
         </w:tc>
@@ -17863,16 +17369,8 @@
               <w:rPr>
                 <w:rFonts w:ascii="맑은 고딕" w:eastAsia="맑은 고딕" w:hAnsi="맑은 고딕" w:cs="맑은 고딕"/>
               </w:rPr>
-              <w:t xml:space="preserve">주요 </w:t>
-            </w:r>
-            <w:proofErr w:type="spellStart"/>
-            <w:r>
-              <w:rPr>
-                <w:rFonts w:ascii="맑은 고딕" w:eastAsia="맑은 고딕" w:hAnsi="맑은 고딕" w:cs="맑은 고딕"/>
-              </w:rPr>
-              <w:t>액터</w:t>
-            </w:r>
-            <w:proofErr w:type="spellEnd"/>
+              <w:t>주요 액터</w:t>
+            </w:r>
           </w:p>
         </w:tc>
         <w:tc>
@@ -18370,21 +17868,7 @@
               <w:rPr>
                 <w:rFonts w:ascii="맑은 고딕" w:eastAsia="맑은 고딕" w:hAnsi="맑은 고딕" w:cs="맑은 고딕" w:hint="eastAsia"/>
               </w:rPr>
-              <w:t xml:space="preserve">nclude </w:t>
-            </w:r>
-            <w:proofErr w:type="gramStart"/>
-            <w:r>
-              <w:rPr>
-                <w:rFonts w:ascii="맑은 고딕" w:eastAsia="맑은 고딕" w:hAnsi="맑은 고딕" w:cs="맑은 고딕" w:hint="eastAsia"/>
-              </w:rPr>
-              <w:t>&lt;-</w:t>
-            </w:r>
-            <w:proofErr w:type="gramEnd"/>
-            <w:r>
-              <w:rPr>
-                <w:rFonts w:ascii="맑은 고딕" w:eastAsia="맑은 고딕" w:hAnsi="맑은 고딕" w:cs="맑은 고딕" w:hint="eastAsia"/>
-              </w:rPr>
-              <w:t xml:space="preserve"> UC-03</w:t>
+              <w:t>nclude &lt;- UC-03</w:t>
             </w:r>
           </w:p>
         </w:tc>
@@ -18743,16 +18227,8 @@
               <w:rPr>
                 <w:rFonts w:ascii="맑은 고딕" w:eastAsia="맑은 고딕" w:hAnsi="맑은 고딕" w:cs="맑은 고딕" w:hint="eastAsia"/>
               </w:rPr>
-              <w:t xml:space="preserve">AI </w:t>
-            </w:r>
-            <w:proofErr w:type="spellStart"/>
-            <w:r>
-              <w:rPr>
-                <w:rFonts w:ascii="맑은 고딕" w:eastAsia="맑은 고딕" w:hAnsi="맑은 고딕" w:cs="맑은 고딕" w:hint="eastAsia"/>
-              </w:rPr>
-              <w:t>챗봇</w:t>
-            </w:r>
-            <w:proofErr w:type="spellEnd"/>
+              <w:t>AI 챗봇</w:t>
+            </w:r>
           </w:p>
         </w:tc>
         <w:tc>
@@ -19034,19 +18510,11 @@
       <w:r>
         <w:t xml:space="preserve"> </w:t>
       </w:r>
-      <w:proofErr w:type="spellStart"/>
       <w:r>
         <w:rPr>
           <w:rFonts w:hint="eastAsia"/>
         </w:rPr>
-        <w:t>유스케이스</w:t>
-      </w:r>
-      <w:proofErr w:type="spellEnd"/>
-      <w:r>
-        <w:rPr>
-          <w:rFonts w:hint="eastAsia"/>
-        </w:rPr>
-        <w:t xml:space="preserve"> 시나리오</w:t>
+        <w:t>유스케이스 시나리오</w:t>
       </w:r>
     </w:p>
     <w:p>
@@ -19257,17 +18725,8 @@
                 <w:rFonts w:asciiTheme="minorHAnsi" w:eastAsiaTheme="minorHAnsi" w:hAnsiTheme="minorHAnsi"/>
                 <w:b/>
               </w:rPr>
-              <w:t xml:space="preserve">주요 </w:t>
-            </w:r>
-            <w:proofErr w:type="spellStart"/>
-            <w:r>
-              <w:rPr>
-                <w:rFonts w:asciiTheme="minorHAnsi" w:eastAsiaTheme="minorHAnsi" w:hAnsiTheme="minorHAnsi"/>
-                <w:b/>
-              </w:rPr>
-              <w:t>액터</w:t>
-            </w:r>
-            <w:proofErr w:type="spellEnd"/>
+              <w:t>주요 액터</w:t>
+            </w:r>
           </w:p>
         </w:tc>
         <w:tc>
@@ -19934,17 +19393,8 @@
                 <w:rFonts w:asciiTheme="minorHAnsi" w:eastAsiaTheme="minorHAnsi" w:hAnsiTheme="minorHAnsi"/>
                 <w:b/>
               </w:rPr>
-              <w:t xml:space="preserve">주요 </w:t>
-            </w:r>
-            <w:proofErr w:type="spellStart"/>
-            <w:r>
-              <w:rPr>
-                <w:rFonts w:asciiTheme="minorHAnsi" w:eastAsiaTheme="minorHAnsi" w:hAnsiTheme="minorHAnsi"/>
-                <w:b/>
-              </w:rPr>
-              <w:t>액터</w:t>
-            </w:r>
-            <w:proofErr w:type="spellEnd"/>
+              <w:t>주요 액터</w:t>
+            </w:r>
           </w:p>
         </w:tc>
         <w:tc>
@@ -20584,17 +20034,8 @@
                 <w:rFonts w:asciiTheme="minorHAnsi" w:eastAsiaTheme="minorHAnsi" w:hAnsiTheme="minorHAnsi"/>
                 <w:b/>
               </w:rPr>
-              <w:t xml:space="preserve">주요 </w:t>
-            </w:r>
-            <w:proofErr w:type="spellStart"/>
-            <w:r>
-              <w:rPr>
-                <w:rFonts w:asciiTheme="minorHAnsi" w:eastAsiaTheme="minorHAnsi" w:hAnsiTheme="minorHAnsi"/>
-                <w:b/>
-              </w:rPr>
-              <w:t>액터</w:t>
-            </w:r>
-            <w:proofErr w:type="spellEnd"/>
+              <w:t>주요 액터</w:t>
+            </w:r>
           </w:p>
         </w:tc>
         <w:tc>
@@ -21203,17 +20644,8 @@
                 <w:rFonts w:asciiTheme="minorHAnsi" w:eastAsiaTheme="minorHAnsi" w:hAnsiTheme="minorHAnsi"/>
                 <w:b/>
               </w:rPr>
-              <w:t xml:space="preserve">주요 </w:t>
-            </w:r>
-            <w:proofErr w:type="spellStart"/>
-            <w:r>
-              <w:rPr>
-                <w:rFonts w:asciiTheme="minorHAnsi" w:eastAsiaTheme="minorHAnsi" w:hAnsiTheme="minorHAnsi"/>
-                <w:b/>
-              </w:rPr>
-              <w:t>액터</w:t>
-            </w:r>
-            <w:proofErr w:type="spellEnd"/>
+              <w:t>주요 액터</w:t>
+            </w:r>
           </w:p>
         </w:tc>
         <w:tc>
@@ -21762,17 +21194,8 @@
                 <w:rFonts w:asciiTheme="minorHAnsi" w:eastAsiaTheme="minorHAnsi" w:hAnsiTheme="minorHAnsi"/>
                 <w:b/>
               </w:rPr>
-              <w:t xml:space="preserve">주요 </w:t>
-            </w:r>
-            <w:proofErr w:type="spellStart"/>
-            <w:r>
-              <w:rPr>
-                <w:rFonts w:asciiTheme="minorHAnsi" w:eastAsiaTheme="minorHAnsi" w:hAnsiTheme="minorHAnsi"/>
-                <w:b/>
-              </w:rPr>
-              <w:t>액터</w:t>
-            </w:r>
-            <w:proofErr w:type="spellEnd"/>
+              <w:t>주요 액터</w:t>
+            </w:r>
           </w:p>
         </w:tc>
         <w:tc>
@@ -22351,17 +21774,8 @@
                 <w:rFonts w:asciiTheme="minorHAnsi" w:eastAsiaTheme="minorHAnsi" w:hAnsiTheme="minorHAnsi"/>
                 <w:b/>
               </w:rPr>
-              <w:t xml:space="preserve">주요 </w:t>
-            </w:r>
-            <w:proofErr w:type="spellStart"/>
-            <w:r>
-              <w:rPr>
-                <w:rFonts w:asciiTheme="minorHAnsi" w:eastAsiaTheme="minorHAnsi" w:hAnsiTheme="minorHAnsi"/>
-                <w:b/>
-              </w:rPr>
-              <w:t>액터</w:t>
-            </w:r>
-            <w:proofErr w:type="spellEnd"/>
+              <w:t>주요 액터</w:t>
+            </w:r>
           </w:p>
         </w:tc>
         <w:tc>
@@ -22847,17 +22261,8 @@
                 <w:rFonts w:asciiTheme="minorHAnsi" w:eastAsiaTheme="minorHAnsi" w:hAnsiTheme="minorHAnsi"/>
                 <w:b/>
               </w:rPr>
-              <w:t xml:space="preserve">주요 </w:t>
-            </w:r>
-            <w:proofErr w:type="spellStart"/>
-            <w:r>
-              <w:rPr>
-                <w:rFonts w:asciiTheme="minorHAnsi" w:eastAsiaTheme="minorHAnsi" w:hAnsiTheme="minorHAnsi"/>
-                <w:b/>
-              </w:rPr>
-              <w:t>액터</w:t>
-            </w:r>
-            <w:proofErr w:type="spellEnd"/>
+              <w:t>주요 액터</w:t>
+            </w:r>
           </w:p>
         </w:tc>
         <w:tc>
@@ -23531,17 +22936,8 @@
                 <w:rFonts w:asciiTheme="minorHAnsi" w:eastAsiaTheme="minorHAnsi" w:hAnsiTheme="minorHAnsi"/>
                 <w:b/>
               </w:rPr>
-              <w:t xml:space="preserve">주요 </w:t>
-            </w:r>
-            <w:proofErr w:type="spellStart"/>
-            <w:r>
-              <w:rPr>
-                <w:rFonts w:asciiTheme="minorHAnsi" w:eastAsiaTheme="minorHAnsi" w:hAnsiTheme="minorHAnsi"/>
-                <w:b/>
-              </w:rPr>
-              <w:t>액터</w:t>
-            </w:r>
-            <w:proofErr w:type="spellEnd"/>
+              <w:t>주요 액터</w:t>
+            </w:r>
           </w:p>
         </w:tc>
         <w:tc>
@@ -24176,17 +23572,8 @@
                 <w:rFonts w:asciiTheme="minorHAnsi" w:eastAsiaTheme="minorHAnsi" w:hAnsiTheme="minorHAnsi"/>
                 <w:b/>
               </w:rPr>
-              <w:t xml:space="preserve">주요 </w:t>
-            </w:r>
-            <w:proofErr w:type="spellStart"/>
-            <w:r>
-              <w:rPr>
-                <w:rFonts w:asciiTheme="minorHAnsi" w:eastAsiaTheme="minorHAnsi" w:hAnsiTheme="minorHAnsi"/>
-                <w:b/>
-              </w:rPr>
-              <w:t>액터</w:t>
-            </w:r>
-            <w:proofErr w:type="spellEnd"/>
+              <w:t>주요 액터</w:t>
+            </w:r>
           </w:p>
         </w:tc>
         <w:tc>
@@ -24601,7 +23988,7 @@
           <w:sz w:val="24"/>
           <w:szCs w:val="24"/>
         </w:rPr>
-        <w:t>사용자 정보 삭제</w:t>
+        <w:t>회원 탈퇴</w:t>
       </w:r>
     </w:p>
     <w:tbl>
@@ -24760,17 +24147,8 @@
                 <w:rFonts w:asciiTheme="minorHAnsi" w:eastAsiaTheme="minorHAnsi" w:hAnsiTheme="minorHAnsi"/>
                 <w:b/>
               </w:rPr>
-              <w:t xml:space="preserve">주요 </w:t>
-            </w:r>
-            <w:proofErr w:type="spellStart"/>
-            <w:r>
-              <w:rPr>
-                <w:rFonts w:asciiTheme="minorHAnsi" w:eastAsiaTheme="minorHAnsi" w:hAnsiTheme="minorHAnsi"/>
-                <w:b/>
-              </w:rPr>
-              <w:t>액터</w:t>
-            </w:r>
-            <w:proofErr w:type="spellEnd"/>
+              <w:t>주요 액터</w:t>
+            </w:r>
           </w:p>
         </w:tc>
         <w:tc>
@@ -25079,27 +24457,43 @@
               <w:rPr>
                 <w:rFonts w:asciiTheme="minorHAnsi" w:eastAsiaTheme="minorHAnsi" w:hAnsiTheme="minorHAnsi" w:hint="eastAsia"/>
               </w:rPr>
-              <w:t xml:space="preserve">해당 회원을 </w:t>
-            </w:r>
-            <w:proofErr w:type="spellStart"/>
+              <w:t>해당 회원을 탈퇴</w:t>
+            </w:r>
+            <w:r>
+              <w:rPr>
+                <w:rFonts w:asciiTheme="minorHAnsi" w:eastAsiaTheme="minorHAnsi" w:hAnsiTheme="minorHAnsi"/>
+              </w:rPr>
+              <w:t>시키겠습니까</w:t>
+            </w:r>
             <w:r>
               <w:rPr>
                 <w:rFonts w:asciiTheme="minorHAnsi" w:eastAsiaTheme="minorHAnsi" w:hAnsiTheme="minorHAnsi" w:hint="eastAsia"/>
               </w:rPr>
-              <w:t>탈퇴</w:t>
-            </w:r>
-            <w:r>
-              <w:rPr>
-                <w:rFonts w:asciiTheme="minorHAnsi" w:eastAsiaTheme="minorHAnsi" w:hAnsiTheme="minorHAnsi"/>
-              </w:rPr>
-              <w:t>시키겠습니까</w:t>
-            </w:r>
-            <w:proofErr w:type="spellEnd"/>
+              <w:t>?</w:t>
+            </w:r>
+            <w:r>
+              <w:rPr>
+                <w:rFonts w:asciiTheme="minorHAnsi" w:eastAsiaTheme="minorHAnsi" w:hAnsiTheme="minorHAnsi"/>
+              </w:rPr>
+              <w:t>”</w:t>
+            </w:r>
             <w:r>
               <w:rPr>
                 <w:rFonts w:asciiTheme="minorHAnsi" w:eastAsiaTheme="minorHAnsi" w:hAnsiTheme="minorHAnsi" w:hint="eastAsia"/>
               </w:rPr>
-              <w:t>?</w:t>
+              <w:t xml:space="preserve"> 메시지 출력 후 </w:t>
+            </w:r>
+            <w:r>
+              <w:rPr>
+                <w:rFonts w:asciiTheme="minorHAnsi" w:eastAsiaTheme="minorHAnsi" w:hAnsiTheme="minorHAnsi"/>
+              </w:rPr>
+              <w:t>“</w:t>
+            </w:r>
+            <w:r>
+              <w:rPr>
+                <w:rFonts w:asciiTheme="minorHAnsi" w:eastAsiaTheme="minorHAnsi" w:hAnsiTheme="minorHAnsi" w:hint="eastAsia"/>
+              </w:rPr>
+              <w:t>예</w:t>
             </w:r>
             <w:r>
               <w:rPr>
@@ -25111,7 +24505,7 @@
               <w:rPr>
                 <w:rFonts w:asciiTheme="minorHAnsi" w:eastAsiaTheme="minorHAnsi" w:hAnsiTheme="minorHAnsi" w:hint="eastAsia"/>
               </w:rPr>
-              <w:t xml:space="preserve"> 메시지 출력 후 </w:t>
+              <w:t xml:space="preserve">를 눌러 회원을 탈퇴 시키거나, </w:t>
             </w:r>
             <w:r>
               <w:rPr>
@@ -25123,7 +24517,7 @@
               <w:rPr>
                 <w:rFonts w:asciiTheme="minorHAnsi" w:eastAsiaTheme="minorHAnsi" w:hAnsiTheme="minorHAnsi" w:hint="eastAsia"/>
               </w:rPr>
-              <w:t>예</w:t>
+              <w:t>아니요</w:t>
             </w:r>
             <w:r>
               <w:rPr>
@@ -25131,65 +24525,11 @@
               </w:rPr>
               <w:t>”</w:t>
             </w:r>
-            <w:proofErr w:type="spellStart"/>
             <w:r>
               <w:rPr>
                 <w:rFonts w:asciiTheme="minorHAnsi" w:eastAsiaTheme="minorHAnsi" w:hAnsiTheme="minorHAnsi" w:hint="eastAsia"/>
               </w:rPr>
-              <w:t>를</w:t>
-            </w:r>
-            <w:proofErr w:type="spellEnd"/>
-            <w:r>
-              <w:rPr>
-                <w:rFonts w:asciiTheme="minorHAnsi" w:eastAsiaTheme="minorHAnsi" w:hAnsiTheme="minorHAnsi" w:hint="eastAsia"/>
-              </w:rPr>
-              <w:t xml:space="preserve"> 눌러 회원을 </w:t>
-            </w:r>
-            <w:proofErr w:type="gramStart"/>
-            <w:r>
-              <w:rPr>
-                <w:rFonts w:asciiTheme="minorHAnsi" w:eastAsiaTheme="minorHAnsi" w:hAnsiTheme="minorHAnsi" w:hint="eastAsia"/>
-              </w:rPr>
-              <w:t>탈퇴 시키거나</w:t>
-            </w:r>
-            <w:proofErr w:type="gramEnd"/>
-            <w:r>
-              <w:rPr>
-                <w:rFonts w:asciiTheme="minorHAnsi" w:eastAsiaTheme="minorHAnsi" w:hAnsiTheme="minorHAnsi" w:hint="eastAsia"/>
-              </w:rPr>
-              <w:t xml:space="preserve">, </w:t>
-            </w:r>
-            <w:r>
-              <w:rPr>
-                <w:rFonts w:asciiTheme="minorHAnsi" w:eastAsiaTheme="minorHAnsi" w:hAnsiTheme="minorHAnsi"/>
-              </w:rPr>
-              <w:t>“</w:t>
-            </w:r>
-            <w:r>
-              <w:rPr>
-                <w:rFonts w:asciiTheme="minorHAnsi" w:eastAsiaTheme="minorHAnsi" w:hAnsiTheme="minorHAnsi" w:hint="eastAsia"/>
-              </w:rPr>
-              <w:t>아니요</w:t>
-            </w:r>
-            <w:r>
-              <w:rPr>
-                <w:rFonts w:asciiTheme="minorHAnsi" w:eastAsiaTheme="minorHAnsi" w:hAnsiTheme="minorHAnsi"/>
-              </w:rPr>
-              <w:t>”</w:t>
-            </w:r>
-            <w:proofErr w:type="spellStart"/>
-            <w:r>
-              <w:rPr>
-                <w:rFonts w:asciiTheme="minorHAnsi" w:eastAsiaTheme="minorHAnsi" w:hAnsiTheme="minorHAnsi" w:hint="eastAsia"/>
-              </w:rPr>
-              <w:t>를</w:t>
-            </w:r>
-            <w:proofErr w:type="spellEnd"/>
-            <w:r>
-              <w:rPr>
-                <w:rFonts w:asciiTheme="minorHAnsi" w:eastAsiaTheme="minorHAnsi" w:hAnsiTheme="minorHAnsi" w:hint="eastAsia"/>
-              </w:rPr>
-              <w:t xml:space="preserve"> 눌러 탈퇴를 취소한다.</w:t>
+              <w:t>를 눌러 탈퇴를 취소한다.</w:t>
             </w:r>
           </w:p>
         </w:tc>
@@ -25524,21 +24864,7 @@
         <w:rPr>
           <w:rFonts w:hint="eastAsia"/>
         </w:rPr>
-        <w:t xml:space="preserve">요구사항 </w:t>
-      </w:r>
-      <w:proofErr w:type="spellStart"/>
-      <w:r>
-        <w:rPr>
-          <w:rFonts w:hint="eastAsia"/>
-        </w:rPr>
-        <w:t>추적표</w:t>
-      </w:r>
-      <w:proofErr w:type="spellEnd"/>
-      <w:r>
-        <w:rPr>
-          <w:rFonts w:hint="eastAsia"/>
-        </w:rPr>
-        <w:t>(</w:t>
+        <w:t>요구사항 추적표(</w:t>
       </w:r>
       <w:r>
         <w:t>RTM</w:t>

</xml_diff>